<commit_message>
Ficha RLC adaptada al montaje real: 10 mH, 3 nF, caja de décadas y capacidad del osciloscopio
Co-Authored-By: Claude Opus 5.5 <noreply@anthropic.com>
Claude-Session: https://claude.ai/code/session_01GdrGkTkQ1SpY6BWmf3EBwF
</commit_message>
<xml_diff>
--- a/fichas/fai-rlc.docx
+++ b/fichas/fai-rlc.docx
@@ -1150,7 +1150,7 @@
       <w:r>
         <w:drawing>
           <wp:inline>
-            <wp:extent cx="2879999" cy="1165913"/>
+            <wp:extent cx="2879999" cy="1055748"/>
             <wp:effectExtent b="0" l="0" r="0" t="0"/>
             <wp:docPr descr="Figura 1. Circuito RLC serie con generador de onda cuadrada y osciloscopio." title="" id="24" name="Picture"/>
             <a:graphic>
@@ -1171,7 +1171,7 @@
                   <pic:spPr bwMode="auto">
                     <a:xfrm>
                       <a:off x="0" y="0"/>
-                      <a:ext cx="2879999" cy="1165913"/>
+                      <a:ext cx="2879999" cy="1055748"/>
                     </a:xfrm>
                     <a:prstGeom prst="rect">
                       <a:avLst/>
@@ -1205,7 +1205,29 @@
         <w:jc w:val="both"/>
       </w:pPr>
       <w:r>
-        <w:t xml:space="preserve">Montar el circuito de la Figura 1 con la bobina, el condensador y la caja de resistencias como</w:t>
+        <w:t xml:space="preserve">Montar en la placa el circuito de la Figura 1: la bobina (</w:t>
+      </w:r>
+      <m:oMath>
+        <m:r>
+          <m:t>L</m:t>
+        </m:r>
+      </m:oMath>
+      <w:r>
+        <w:t xml:space="preserve"> </w:t>
+      </w:r>
+      <w:r>
+        <w:t xml:space="preserve">= 10 mH), el condensador (</w:t>
+      </w:r>
+      <m:oMath>
+        <m:r>
+          <m:t>C</m:t>
+        </m:r>
+      </m:oMath>
+      <w:r>
+        <w:t xml:space="preserve"> </w:t>
+      </w:r>
+      <w:r>
+        <w:t xml:space="preserve">= 3 nF) y la caja de resistencias de décadas como</w:t>
       </w:r>
       <w:r>
         <w:t xml:space="preserve"> </w:t>
@@ -1216,7 +1238,7 @@
         </m:r>
       </m:oMath>
       <w:r>
-        <w:t xml:space="preserve">. El generador de funciones da una onda cuadrada de unos 100 Hz. El canal 1 del osciloscopio mide la tensión del generador y el canal 2 la del condensador, con las masas en el mismo punto. Medir con el polímetro</w:t>
+        <w:t xml:space="preserve">. El generador de funciones da una onda cuadrada de unos 200 Hz. El osciloscopio mide la tensión del condensador, con la masa de la sonda en el mismo punto que la del generador. Medir con el polímetro</w:t>
       </w:r>
       <w:r>
         <w:t xml:space="preserve"> </w:t>
@@ -1236,34 +1258,6 @@
         </m:sSub>
       </m:oMath>
       <w:r>
-        <w:t xml:space="preserve"> </w:t>
-      </w:r>
-      <w:r>
-        <w:t xml:space="preserve">y anotar los valores nominales de</w:t>
-      </w:r>
-      <w:r>
-        <w:t xml:space="preserve"> </w:t>
-      </w:r>
-      <m:oMath>
-        <m:r>
-          <m:t>C</m:t>
-        </m:r>
-      </m:oMath>
-      <w:r>
-        <w:t xml:space="preserve"> </w:t>
-      </w:r>
-      <w:r>
-        <w:t xml:space="preserve">y</w:t>
-      </w:r>
-      <w:r>
-        <w:t xml:space="preserve"> </w:t>
-      </w:r>
-      <m:oMath>
-        <m:r>
-          <m:t>L</m:t>
-        </m:r>
-      </m:oMath>
-      <w:r>
         <w:t xml:space="preserve">.</w:t>
       </w:r>
     </w:p>
@@ -1272,50 +1266,38 @@
         <w:pStyle w:val="BodyText"/>
         <w:jc w:val="both"/>
       </w:pPr>
-      <m:oMath>
-        <m:r>
-          <m:t>C</m:t>
-        </m:r>
-      </m:oMath>
-      <w:r>
-        <w:t xml:space="preserve"> </w:t>
-      </w:r>
-      <w:r>
-        <w:t xml:space="preserve">= __________</w:t>
-      </w:r>
-      <w:r>
-        <w:t xml:space="preserve"> </w:t>
-      </w:r>
-      <m:oMath>
-        <m:r>
-          <m:t>  </m:t>
-        </m:r>
-        <m:r>
-          <m:t>L</m:t>
-        </m:r>
-      </m:oMath>
-      <w:r>
-        <w:t xml:space="preserve"> </w:t>
-      </w:r>
-      <w:r>
-        <w:t xml:space="preserve">= __________</w:t>
-      </w:r>
-      <w:r>
-        <w:t xml:space="preserve"> </w:t>
-      </w:r>
-      <m:oMath>
-        <m:r>
-          <m:t>  </m:t>
-        </m:r>
+      <w:r>
+        <w:rPr>
+          <w:bCs/>
+          <w:b/>
+        </w:rPr>
+        <w:t xml:space="preserve">Capacidad del osciloscopio.</w:t>
+      </w:r>
+      <w:r>
+        <w:t xml:space="preserve"> </w:t>
+      </w:r>
+      <w:r>
+        <w:t xml:space="preserve">La entrada del osciloscopio equivale a 1 MΩ en paralelo con unos 20 pF (viene indicado junto al conector), más la capacidad de la sonda y del cable. Esa capacidad</w:t>
+      </w:r>
+      <w:r>
+        <w:t xml:space="preserve"> </w:t>
+      </w:r>
+      <m:oMath>
         <m:sSub>
           <m:e>
             <m:r>
-              <m:t>R</m:t>
+              <m:t>C</m:t>
             </m:r>
           </m:e>
           <m:sub>
             <m:r>
-              <m:t>L</m:t>
+              <m:t>o</m:t>
+            </m:r>
+            <m:r>
+              <m:t>s</m:t>
+            </m:r>
+            <m:r>
+              <m:t>c</m:t>
             </m:r>
           </m:sub>
         </m:sSub>
@@ -1324,33 +1306,184 @@
         <w:t xml:space="preserve"> </w:t>
       </w:r>
       <w:r>
-        <w:t xml:space="preserve">= __________</w:t>
-      </w:r>
-      <w:r>
-        <w:t xml:space="preserve"> </w:t>
-      </w:r>
-      <m:oMath>
-        <m:r>
-          <m:t>  </m:t>
-        </m:r>
+        <w:t xml:space="preserve">queda en paralelo con el condensador, así que la capacidad efectiva es</w:t>
+      </w:r>
+      <w:r>
+        <w:t xml:space="preserve"> </w:t>
+      </w:r>
+      <m:oMath>
         <m:sSub>
           <m:e>
             <m:r>
-              <m:t>R</m:t>
+              <m:t>C</m:t>
             </m:r>
           </m:e>
           <m:sub>
             <m:r>
-              <m:t>g</m:t>
+              <m:t>T</m:t>
             </m:r>
           </m:sub>
         </m:sSub>
+        <m:r>
+          <m:rPr>
+            <m:sty m:val="p"/>
+          </m:rPr>
+          <m:t>=</m:t>
+        </m:r>
+        <m:r>
+          <m:t>C</m:t>
+        </m:r>
+        <m:r>
+          <m:rPr>
+            <m:sty m:val="p"/>
+          </m:rPr>
+          <m:t>+</m:t>
+        </m:r>
+        <m:sSub>
+          <m:e>
+            <m:r>
+              <m:t>C</m:t>
+            </m:r>
+          </m:e>
+          <m:sub>
+            <m:r>
+              <m:t>o</m:t>
+            </m:r>
+            <m:r>
+              <m:t>s</m:t>
+            </m:r>
+            <m:r>
+              <m:t>c</m:t>
+            </m:r>
+          </m:sub>
+        </m:sSub>
+      </m:oMath>
+      <w:r>
+        <w:t xml:space="preserve">. Si la sonda tiene conmutador ×1/×10, usar ×10, que añade menos capacidad.</w:t>
+      </w:r>
+    </w:p>
+    <w:p>
+      <w:pPr>
+        <w:pStyle w:val="BodyText"/>
+        <w:jc w:val="both"/>
+      </w:pPr>
+      <m:oMath>
+        <m:r>
+          <m:t>C</m:t>
+        </m:r>
+      </m:oMath>
+      <w:r>
+        <w:t xml:space="preserve"> </w:t>
+      </w:r>
+      <w:r>
+        <w:t xml:space="preserve">= __________</w:t>
+      </w:r>
+      <w:r>
+        <w:t xml:space="preserve"> </w:t>
+      </w:r>
+      <m:oMath>
+        <m:r>
+          <m:t>  </m:t>
+        </m:r>
+        <m:r>
+          <m:t>L</m:t>
+        </m:r>
+      </m:oMath>
+      <w:r>
+        <w:t xml:space="preserve"> </w:t>
+      </w:r>
+      <w:r>
+        <w:t xml:space="preserve">= __________</w:t>
+      </w:r>
+      <w:r>
+        <w:t xml:space="preserve"> </w:t>
+      </w:r>
+      <m:oMath>
+        <m:r>
+          <m:t>  </m:t>
+        </m:r>
+        <m:sSub>
+          <m:e>
+            <m:r>
+              <m:t>R</m:t>
+            </m:r>
+          </m:e>
+          <m:sub>
+            <m:r>
+              <m:t>L</m:t>
+            </m:r>
+          </m:sub>
+        </m:sSub>
+      </m:oMath>
+      <w:r>
+        <w:t xml:space="preserve"> </w:t>
+      </w:r>
+      <w:r>
+        <w:t xml:space="preserve">= __________</w:t>
+      </w:r>
+      <w:r>
+        <w:t xml:space="preserve"> </w:t>
+      </w:r>
+      <m:oMath>
+        <m:r>
+          <m:t>  </m:t>
+        </m:r>
+        <m:sSub>
+          <m:e>
+            <m:r>
+              <m:t>R</m:t>
+            </m:r>
+          </m:e>
+          <m:sub>
+            <m:r>
+              <m:t>g</m:t>
+            </m:r>
+          </m:sub>
+        </m:sSub>
       </m:oMath>
       <w:r>
         <w:t xml:space="preserve"> </w:t>
       </w:r>
       <w:r>
         <w:t xml:space="preserve">= 50 Ω</w:t>
+      </w:r>
+      <w:r>
+        <w:t xml:space="preserve"> </w:t>
+      </w:r>
+      <m:oMath>
+        <m:r>
+          <m:t>  </m:t>
+        </m:r>
+        <m:sSub>
+          <m:e>
+            <m:r>
+              <m:t>C</m:t>
+            </m:r>
+          </m:e>
+          <m:sub>
+            <m:r>
+              <m:t>o</m:t>
+            </m:r>
+            <m:r>
+              <m:t>s</m:t>
+            </m:r>
+            <m:r>
+              <m:t>c</m:t>
+            </m:r>
+          </m:sub>
+        </m:sSub>
+        <m:r>
+          <m:rPr>
+            <m:sty m:val="p"/>
+          </m:rPr>
+          <m:t>≈</m:t>
+        </m:r>
+      </m:oMath>
+      <w:r>
+        <w:t xml:space="preserve"> </w:t>
+      </w:r>
+      <w:r>
+        <w:t xml:space="preserve">__________</w:t>
       </w:r>
     </w:p>
     <w:bookmarkEnd w:id="26"/>
@@ -1406,7 +1539,7 @@
         </m:r>
       </m:oMath>
       <w:r>
-        <w:t xml:space="preserve">, ajustar la base de tiempos para ver una sola respuesta (un flanco de subida) ocupando toda la pantalla. Medir con los cursores el tiempo de 3 periodos para obtener</w:t>
+        <w:t xml:space="preserve">, ajustar la base de tiempos (unos 50 µs/div) para ver una sola respuesta, un flanco de subida, ocupando toda la pantalla. Medir con los cursores el tiempo de 5 periodos para obtener</w:t>
       </w:r>
       <w:r>
         <w:t xml:space="preserve"> </w:t>
@@ -1434,7 +1567,7 @@
         <w:t xml:space="preserve"> </w:t>
       </w:r>
       <w:r>
-        <w:t xml:space="preserve">= 50 Ω.</w:t>
+        <w:t xml:space="preserve">= 200 Ω.</w:t>
       </w:r>
     </w:p>
     <w:tbl>
@@ -1521,7 +1654,7 @@
               <w:rPr>
                 <w:sz w:val="20"/>
               </w:rPr>
-              <w:t xml:space="preserve">(ms)</w:t>
+              <w:t xml:space="preserve">(µs)</w:t>
             </w:r>
           </w:p>
         </w:tc>
@@ -2300,7 +2433,74 @@
         </m:sSub>
       </m:oMath>
       <w:r>
-        <w:t xml:space="preserve">. Compárelo con el medido.</w:t>
+        <w:t xml:space="preserve">, primero con</w:t>
+      </w:r>
+      <w:r>
+        <w:t xml:space="preserve"> </w:t>
+      </w:r>
+      <m:oMath>
+        <m:r>
+          <m:t>C</m:t>
+        </m:r>
+      </m:oMath>
+      <w:r>
+        <w:t xml:space="preserve"> </w:t>
+      </w:r>
+      <w:r>
+        <w:t xml:space="preserve">y después con</w:t>
+      </w:r>
+      <w:r>
+        <w:t xml:space="preserve"> </w:t>
+      </w:r>
+      <m:oMath>
+        <m:sSub>
+          <m:e>
+            <m:r>
+              <m:t>C</m:t>
+            </m:r>
+          </m:e>
+          <m:sub>
+            <m:r>
+              <m:t>T</m:t>
+            </m:r>
+          </m:sub>
+        </m:sSub>
+        <m:r>
+          <m:rPr>
+            <m:sty m:val="p"/>
+          </m:rPr>
+          <m:t>=</m:t>
+        </m:r>
+        <m:r>
+          <m:t>C</m:t>
+        </m:r>
+        <m:r>
+          <m:rPr>
+            <m:sty m:val="p"/>
+          </m:rPr>
+          <m:t>+</m:t>
+        </m:r>
+        <m:sSub>
+          <m:e>
+            <m:r>
+              <m:t>C</m:t>
+            </m:r>
+          </m:e>
+          <m:sub>
+            <m:r>
+              <m:t>o</m:t>
+            </m:r>
+            <m:r>
+              <m:t>s</m:t>
+            </m:r>
+            <m:r>
+              <m:t>c</m:t>
+            </m:r>
+          </m:sub>
+        </m:sSub>
+      </m:oMath>
+      <w:r>
+        <w:t xml:space="preserve">. Compárelos con el medido. ¿Es apreciable el efecto del osciloscopio con este condensador? ¿Y si se usara uno de 100 pF?</w:t>
       </w:r>
     </w:p>
     <w:tbl>
@@ -2576,9 +2776,18 @@
               </m:rPr>
               <m:t>/</m:t>
             </m:r>
-            <m:r>
-              <m:t>C</m:t>
-            </m:r>
+            <m:sSub>
+              <m:e>
+                <m:r>
+                  <m:t>C</m:t>
+                </m:r>
+              </m:e>
+              <m:sub>
+                <m:r>
+                  <m:t>T</m:t>
+                </m:r>
+              </m:sub>
+            </m:sSub>
           </m:e>
         </m:rad>
         <m:r>

</xml_diff>

<commit_message>
Ficha RLC: apartado de cómo medir en el osciloscopio
Co-Authored-By: Claude Opus 5.5 <noreply@anthropic.com>
Claude-Session: https://claude.ai/code/session_01GdrGkTkQ1SpY6BWmf3EBwF
</commit_message>
<xml_diff>
--- a/fichas/fai-rlc.docx
+++ b/fichas/fai-rlc.docx
@@ -1589,7 +1589,7 @@
       </w:tr>
     </w:tbl>
     <w:bookmarkEnd w:id="29"/>
-    <w:bookmarkStart w:id="32" w:name="resultados"/>
+    <w:bookmarkStart w:id="36" w:name="resultados"/>
     <w:p>
       <w:pPr>
         <w:pStyle w:val="Heading2"/>
@@ -1606,7 +1606,7 @@
         <w:t xml:space="preserve">Resultados</w:t>
       </w:r>
     </w:p>
-    <w:bookmarkStart w:id="30" w:name="parte-a.-oscilación-amortiguada"/>
+    <w:bookmarkStart w:id="33" w:name="cómo-medir-en-el-osciloscopio"/>
     <w:p>
       <w:pPr>
         <w:pStyle w:val="Heading3"/>
@@ -1621,6 +1621,146 @@
           <w:i w:val="0"/>
           <w:sz w:val="26"/>
         </w:rPr>
+        <w:t xml:space="preserve">Cómo medir en el osciloscopio</w:t>
+      </w:r>
+    </w:p>
+    <w:p>
+      <w:pPr>
+        <w:pStyle w:val="FirstParagraph"/>
+        <w:spacing w:after="120" w:line="276" w:lineRule="auto"/>
+        <w:jc w:val="both"/>
+      </w:pPr>
+      <w:r>
+        <w:t xml:space="preserve">La pantalla del osciloscopio tiene una cuadrícula, y las tensiones y los tiempos se miden contando cuadros (Figura 3). Cada cuadro está dividido en 5 rayitas, así que se puede leer con un decimal, por ejemplo 1,6 cuadros.</w:t>
+      </w:r>
+    </w:p>
+    <w:p>
+      <w:pPr>
+        <w:pStyle w:val="CaptionedFigure"/>
+        <w:jc w:val="center"/>
+      </w:pPr>
+      <w:r>
+        <w:drawing>
+          <wp:inline>
+            <wp:extent cx="4319999" cy="3001395"/>
+            <wp:effectExtent b="0" l="0" r="0" t="0"/>
+            <wp:docPr descr="Figura 3. Pantalla del osciloscopio. La altura del primer máximo sobre el valor final es 1,6 cuadros." title="" id="31" name="Picture"/>
+            <a:graphic>
+              <a:graphicData uri="http://schemas.openxmlformats.org/drawingml/2006/picture">
+                <pic:pic>
+                  <pic:nvPicPr>
+                    <pic:cNvPr descr="fig/osciloscopio.png" id="32" name="Picture"/>
+                    <pic:cNvPicPr>
+                      <a:picLocks noChangeArrowheads="1" noChangeAspect="1"/>
+                    </pic:cNvPicPr>
+                  </pic:nvPicPr>
+                  <pic:blipFill>
+                    <a:blip r:embed="rId30"/>
+                    <a:stretch>
+                      <a:fillRect/>
+                    </a:stretch>
+                  </pic:blipFill>
+                  <pic:spPr bwMode="auto">
+                    <a:xfrm>
+                      <a:off x="0" y="0"/>
+                      <a:ext cx="4319999" cy="3001395"/>
+                    </a:xfrm>
+                    <a:prstGeom prst="rect">
+                      <a:avLst/>
+                    </a:prstGeom>
+                    <a:noFill/>
+                    <a:ln w="9525">
+                      <a:noFill/>
+                      <a:headEnd/>
+                      <a:tailEnd/>
+                    </a:ln>
+                  </pic:spPr>
+                </pic:pic>
+              </a:graphicData>
+            </a:graphic>
+          </wp:inline>
+        </w:drawing>
+      </w:r>
+    </w:p>
+    <w:p>
+      <w:pPr>
+        <w:pStyle w:val="ImageCaption"/>
+        <w:spacing w:after="280"/>
+        <w:jc w:val="center"/>
+      </w:pPr>
+      <w:r>
+        <w:t xml:space="preserve">Figura 3. Pantalla del osciloscopio. La altura del primer máximo sobre el valor final es 1,6 cuadros.</w:t>
+      </w:r>
+    </w:p>
+    <w:p>
+      <w:pPr>
+        <w:pStyle w:val="BodyText"/>
+        <w:spacing w:after="120" w:line="276" w:lineRule="auto"/>
+        <w:jc w:val="both"/>
+      </w:pPr>
+      <w:r>
+        <w:t xml:space="preserve">Lo que vale un cuadro en vertical aparece en la pantalla junto al nombre del canal, por ejemplo «CH1 500 mV», y se cambia con el mando de voltios del canal. Para medir una tensión se cuentan los cuadros en vertical y se multiplican por ese valor. En la Figura 3, la altura del primer máximo sobre el valor final es</w:t>
+      </w:r>
+      <w:r>
+        <w:t xml:space="preserve"> </w:t>
+      </w:r>
+      <m:oMath>
+        <m:sSub>
+          <m:e>
+            <m:r>
+              <m:t>V</m:t>
+            </m:r>
+          </m:e>
+          <m:sub>
+            <m:r>
+              <m:t>0</m:t>
+            </m:r>
+          </m:sub>
+        </m:sSub>
+      </m:oMath>
+      <w:r>
+        <w:t xml:space="preserve"> </w:t>
+      </w:r>
+      <w:r>
+        <w:t xml:space="preserve">= 1,6 × 0,5 V = 0,8 V.</w:t>
+      </w:r>
+    </w:p>
+    <w:p>
+      <w:pPr>
+        <w:pStyle w:val="BodyText"/>
+        <w:spacing w:after="120" w:line="276" w:lineRule="auto"/>
+        <w:jc w:val="both"/>
+      </w:pPr>
+      <w:r>
+        <w:t xml:space="preserve">Lo que vale un cuadro en horizontal también aparece en la pantalla, por ejemplo «20 µs», y se cambia con el mando de la base de tiempos. Los tiempos se miden igual, contando cuadros en horizontal y multiplicando por ese valor.</w:t>
+      </w:r>
+    </w:p>
+    <w:p>
+      <w:pPr>
+        <w:pStyle w:val="BodyText"/>
+        <w:spacing w:after="120" w:line="276" w:lineRule="auto"/>
+        <w:jc w:val="both"/>
+      </w:pPr>
+      <w:r>
+        <w:t xml:space="preserve">El error de cada lectura es una rayita, es decir, 0,2 cuadros multiplicados por lo que vale el cuadro.</w:t>
+      </w:r>
+    </w:p>
+    <w:bookmarkEnd w:id="33"/>
+    <w:bookmarkStart w:id="34" w:name="parte-a.-oscilación-amortiguada"/>
+    <w:p>
+      <w:pPr>
+        <w:pStyle w:val="Heading3"/>
+        <w:numPr>
+          <w:ilvl w:val="0"/>
+          <w:numId w:val="0"/>
+        </w:numPr>
+        <w:spacing w:before="320" w:after="120"/>
+      </w:pPr>
+      <w:r>
+        <w:rPr>
+          <w:i w:val="0"/>
+          <w:sz w:val="26"/>
+        </w:rPr>
         <w:t xml:space="preserve">Parte A. Oscilación amortiguada</w:t>
       </w:r>
     </w:p>
@@ -1645,7 +1785,17 @@
         <w:t xml:space="preserve"> </w:t>
       </w:r>
       <w:r>
-        <w:t xml:space="preserve">= 200 Ω. Ajustar la base de tiempos (unos 50 µs/div) para ver en toda la pantalla una sola respuesta, la que sigue a un salto de subida, como en la Figura 1. Medir con los cursores del osciloscopio el tiempo de 5 periodos, para obtener</w:t>
+        <w:t xml:space="preserve">= 200 Ω. Ajustar la base de tiempos (unos 20 µs por cuadro) para ver en toda la pantalla una sola respuesta, la que sigue a un salto de subida, con el valor final a la derecha, como en la Figura 3. Ajustar los voltios por cuadro para que la oscilación ocupe casi toda la altura de la pantalla.</w:t>
+      </w:r>
+    </w:p>
+    <w:p>
+      <w:pPr>
+        <w:pStyle w:val="BodyText"/>
+        <w:spacing w:after="120" w:line="276" w:lineRule="auto"/>
+        <w:jc w:val="both"/>
+      </w:pPr>
+      <w:r>
+        <w:t xml:space="preserve">Medir la distancia horizontal entre la cresta del primer máximo y la del sexto, que son 5 periodos, para obtener</w:t>
       </w:r>
       <w:r>
         <w:t xml:space="preserve"> </w:t>
@@ -1656,7 +1806,7 @@
         </m:r>
       </m:oMath>
       <w:r>
-        <w:t xml:space="preserve">, y las alturas de los primeros máximos sobre el valor final,</w:t>
+        <w:t xml:space="preserve">. Medir después las alturas de los cinco primeros máximos sobre el valor final,</w:t>
       </w:r>
       <w:r>
         <w:t xml:space="preserve"> </w:t>
@@ -2143,8 +2293,8 @@
         </w:tc>
       </w:tr>
     </w:tbl>
-    <w:bookmarkEnd w:id="30"/>
-    <w:bookmarkStart w:id="31" w:name="parte-b.-resistencia-crítica"/>
+    <w:bookmarkEnd w:id="34"/>
+    <w:bookmarkStart w:id="35" w:name="parte-b.-resistencia-crítica"/>
     <w:p>
       <w:pPr>
         <w:pStyle w:val="Heading3"/>
@@ -2653,9 +2803,9 @@
         </w:tc>
       </w:tr>
     </w:tbl>
-    <w:bookmarkEnd w:id="31"/>
-    <w:bookmarkEnd w:id="32"/>
-    <w:bookmarkStart w:id="33" w:name="cuestiones"/>
+    <w:bookmarkEnd w:id="35"/>
+    <w:bookmarkEnd w:id="36"/>
+    <w:bookmarkStart w:id="37" w:name="cuestiones"/>
     <w:p>
       <w:pPr>
         <w:pStyle w:val="Heading2"/>
@@ -3461,7 +3611,7 @@
         </w:tc>
       </w:tr>
     </w:tbl>
-    <w:bookmarkEnd w:id="33"/>
+    <w:bookmarkEnd w:id="37"/>
     <w:sectPr>
       <w:headerReference w:type="default" r:id="rId9"/>
       <w:footerReference w:type="default" r:id="rId10"/>

</xml_diff>

<commit_message>
Ficha RLC: el alumno elige R para ver al menos 5 oscilaciones; C según el puesto
Co-Authored-By: Claude Opus 5.5 <noreply@anthropic.com>
Claude-Session: https://claude.ai/code/session_01GdrGkTkQ1SpY6BWmf3EBwF
</commit_message>
<xml_diff>
--- a/fichas/fai-rlc.docx
+++ b/fichas/fai-rlc.docx
@@ -1217,7 +1217,10 @@
         <w:t xml:space="preserve"> </w:t>
       </w:r>
       <w:r>
-        <w:t xml:space="preserve">= 10 mH), el condensador (</w:t>
+        <w:t xml:space="preserve">= 10 mH), el condensador y la caja de resistencias. La capacidad</w:t>
+      </w:r>
+      <w:r>
+        <w:t xml:space="preserve"> </w:t>
       </w:r>
       <m:oMath>
         <m:r>
@@ -1228,7 +1231,7 @@
         <w:t xml:space="preserve"> </w:t>
       </w:r>
       <w:r>
-        <w:t xml:space="preserve">= 3 nF) y la caja de resistencias. El generador de funciones da una onda cuadrada de unos 200 Hz. El osciloscopio mide la tensión del condensador, con la masa de la sonda en el mismo punto que la del generador. Medir con el polímetro la resistencia de la bobina,</w:t>
+        <w:t xml:space="preserve">del condensador cambia de un puesto a otro y viene indicada en él. El generador de funciones da una onda cuadrada de unos 200 Hz. El osciloscopio mide la tensión del condensador, con la masa de la sonda en el mismo punto que la del generador. Medir con el polímetro la resistencia de la bobina,</w:t>
       </w:r>
       <w:r>
         <w:t xml:space="preserve"> </w:t>
@@ -1771,7 +1774,7 @@
         <w:jc w:val="both"/>
       </w:pPr>
       <w:r>
-        <w:t xml:space="preserve">Poner la caja en</w:t>
+        <w:t xml:space="preserve">Ajustar la base de tiempos (unos 20 µs por cuadro) para ver en toda la pantalla una sola respuesta, la que sigue a un salto de subida, con el valor final a la derecha, como en la Figura 3. Ajustar los voltios por cuadro para que la oscilación ocupe casi toda la altura de la pantalla. Después, ir cambiando</w:t>
       </w:r>
       <w:r>
         <w:t xml:space="preserve"> </w:t>
@@ -1785,7 +1788,7 @@
         <w:t xml:space="preserve"> </w:t>
       </w:r>
       <w:r>
-        <w:t xml:space="preserve">= 200 Ω. Ajustar la base de tiempos (unos 20 µs por cuadro) para ver en toda la pantalla una sola respuesta, la que sigue a un salto de subida, con el valor final a la derecha, como en la Figura 3. Ajustar los voltios por cuadro para que la oscilación ocupe casi toda la altura de la pantalla.</w:t>
+        <w:t xml:space="preserve">con la caja hasta que se vean al menos 5 oscilaciones claras, es decir, 6 máximos, antes de que la señal se quede en su valor final, y dejar la caja en ese valor durante toda la Parte A.</w:t>
       </w:r>
     </w:p>
     <w:p>
@@ -1854,31 +1857,13 @@
     </w:p>
     <w:p>
       <w:pPr>
-        <w:pStyle w:val="BodyText"/>
-        <w:spacing w:after="120" w:line="276" w:lineRule="auto"/>
-        <w:jc w:val="both"/>
-      </w:pPr>
-      <m:oMath>
-        <m:r>
-          <m:t>T</m:t>
-        </m:r>
-      </m:oMath>
-      <w:r>
-        <w:t xml:space="preserve"> </w:t>
-      </w:r>
-      <w:r>
-        <w:t xml:space="preserve">= ______________ µs</w:t>
-      </w:r>
-    </w:p>
-    <w:p>
-      <w:pPr>
         <w:pStyle w:val="TableCaption"/>
         <w:keepNext/>
         <w:spacing w:after="80" w:before="200"/>
         <w:jc w:val="center"/>
       </w:pPr>
       <w:r>
-        <w:t xml:space="preserve">Tabla 2. Alturas de los máximos sobre el valor final.</w:t>
+        <w:t xml:space="preserve">Tabla 2. Resistencia elegida y periodo.</w:t>
       </w:r>
     </w:p>
     <w:tbl>
@@ -1894,7 +1879,151 @@
           <w:insideV w:val="single" w:sz="6" w:color="000000"/>
         </w:tblBorders>
         <w:tblLook w:firstRow="1" w:lastRow="0" w:firstColumn="0" w:lastColumn="0" w:noHBand="0" w:noVBand="0" w:val="0020"/>
-        <w:tblCaption w:val="Tabla 2. Alturas de los máximos sobre el valor final."/>
+        <w:tblCaption w:val="Tabla 2. Resistencia elegida y periodo."/>
+      </w:tblPr>
+      <w:tblGrid>
+        <w:gridCol w:w="3960"/>
+        <w:gridCol w:w="3960"/>
+      </w:tblGrid>
+      <w:tr>
+        <w:trPr>
+          <w:trHeight w:val="510" w:hRule="atLeast"/>
+          <w:tblHeader w:val="true"/>
+        </w:trPr>
+        <w:tc>
+          <w:tcPr>
+            <w:shd w:val="clear" w:color="auto" w:fill="FFF0C1"/>
+            <w:vAlign w:val="center"/>
+          </w:tcPr>
+          <w:p>
+            <w:pPr>
+              <w:pStyle w:val="Compact"/>
+              <w:keepNext/>
+              <w:jc w:val="center"/>
+            </w:pPr>
+            <m:oMath>
+              <m:r>
+                <m:t>R</m:t>
+              </m:r>
+            </m:oMath>
+            <w:r>
+              <w:rPr>
+                <w:sz w:val="20"/>
+              </w:rPr>
+              <w:t xml:space="preserve"> </w:t>
+            </w:r>
+            <w:r>
+              <w:rPr>
+                <w:sz w:val="20"/>
+              </w:rPr>
+              <w:t xml:space="preserve">de la caja (Ω)</w:t>
+            </w:r>
+          </w:p>
+        </w:tc>
+        <w:tc>
+          <w:tcPr>
+            <w:shd w:val="clear" w:color="auto" w:fill="FFF0C1"/>
+            <w:vAlign w:val="center"/>
+          </w:tcPr>
+          <w:p>
+            <w:pPr>
+              <w:pStyle w:val="Compact"/>
+              <w:keepNext/>
+              <w:jc w:val="center"/>
+            </w:pPr>
+            <m:oMath>
+              <m:r>
+                <m:t>T</m:t>
+              </m:r>
+            </m:oMath>
+            <w:r>
+              <w:rPr>
+                <w:sz w:val="20"/>
+              </w:rPr>
+              <w:t xml:space="preserve"> </w:t>
+            </w:r>
+            <w:r>
+              <w:rPr>
+                <w:sz w:val="20"/>
+              </w:rPr>
+              <w:t xml:space="preserve">(µs)</w:t>
+            </w:r>
+          </w:p>
+        </w:tc>
+      </w:tr>
+      <w:tr>
+        <w:trPr>
+          <w:trHeight w:val="425" w:hRule="atLeast"/>
+        </w:trPr>
+        <w:tc>
+          <w:tcPr>
+            <w:vAlign w:val="center"/>
+          </w:tcPr>
+          <w:p>
+            <w:pPr>
+              <w:pStyle w:val="Compact"/>
+              <w:keepNext/>
+              <w:jc w:val="center"/>
+            </w:pPr>
+            <w:r>
+              <w:rPr>
+                <w:sz w:val="20"/>
+              </w:rPr>
+              <w:t xml:space="preserve"> </w:t>
+            </w:r>
+          </w:p>
+        </w:tc>
+        <w:tc>
+          <w:tcPr>
+            <w:vAlign w:val="center"/>
+          </w:tcPr>
+          <w:p>
+            <w:pPr>
+              <w:pStyle w:val="Compact"/>
+              <w:keepNext/>
+              <w:jc w:val="center"/>
+            </w:pPr>
+            <w:r>
+              <w:rPr>
+                <w:sz w:val="20"/>
+              </w:rPr>
+              <w:t xml:space="preserve"> </w:t>
+            </w:r>
+          </w:p>
+        </w:tc>
+      </w:tr>
+    </w:tbl>
+    <w:p>
+      <w:pPr>
+        <w:spacing w:after="120" w:line="276" w:lineRule="auto" w:before="200"/>
+        <w:jc w:val="both"/>
+      </w:pPr>
+    </w:p>
+    <w:p>
+      <w:pPr>
+        <w:pStyle w:val="TableCaption"/>
+        <w:keepNext/>
+        <w:spacing w:after="80" w:before="200"/>
+        <w:jc w:val="center"/>
+      </w:pPr>
+      <w:r>
+        <w:t xml:space="preserve">Tabla 3. Alturas de los máximos sobre el valor final.</w:t>
+      </w:r>
+    </w:p>
+    <w:tbl>
+      <w:tblPr>
+        <w:tblW w:type="pct" w:w="5000"/>
+        <w:jc w:val="center"/>
+        <w:tblBorders>
+          <w:top w:val="single" w:sz="6" w:color="000000"/>
+          <w:left w:val="single" w:sz="6" w:color="000000"/>
+          <w:bottom w:val="single" w:sz="6" w:color="000000"/>
+          <w:right w:val="single" w:sz="6" w:color="000000"/>
+          <w:insideH w:val="single" w:sz="6" w:color="000000"/>
+          <w:insideV w:val="single" w:sz="6" w:color="000000"/>
+        </w:tblBorders>
+        <w:tblLook w:firstRow="1" w:lastRow="0" w:firstColumn="0" w:lastColumn="0" w:noHBand="0" w:noVBand="0" w:val="0020"/>
+        <w:tblCaption w:val="Tabla 3. Alturas de los máximos sobre el valor final."/>
       </w:tblPr>
       <w:tblGrid>
         <w:gridCol w:w="2640"/>
@@ -2530,7 +2659,7 @@
         <w:jc w:val="center"/>
       </w:pPr>
       <w:r>
-        <w:t xml:space="preserve">Tabla 3. Resistencia crítica medida.</w:t>
+        <w:t xml:space="preserve">Tabla 4. Resistencia crítica medida.</w:t>
       </w:r>
     </w:p>
     <w:tbl>
@@ -2546,7 +2675,7 @@
           <w:insideV w:val="single" w:sz="6" w:color="000000"/>
         </w:tblBorders>
         <w:tblLook w:firstRow="1" w:lastRow="0" w:firstColumn="0" w:lastColumn="0" w:noHBand="0" w:noVBand="0" w:val="0020"/>
-        <w:tblCaption w:val="Tabla 3. Resistencia crítica medida."/>
+        <w:tblCaption w:val="Tabla 4. Resistencia crítica medida."/>
       </w:tblPr>
       <w:tblGrid>
         <w:gridCol w:w="1980"/>
@@ -3019,7 +3148,7 @@
         <w:jc w:val="center"/>
       </w:pPr>
       <w:r>
-        <w:t xml:space="preserve">Tabla 4. Ajuste lineal y ritmo de amortiguamiento.</w:t>
+        <w:t xml:space="preserve">Tabla 5. Ajuste lineal y ritmo de amortiguamiento.</w:t>
       </w:r>
     </w:p>
     <w:tbl>
@@ -3035,7 +3164,7 @@
           <w:insideV w:val="single" w:sz="6" w:color="000000"/>
         </w:tblBorders>
         <w:tblLook w:firstRow="1" w:lastRow="0" w:firstColumn="0" w:lastColumn="0" w:noHBand="0" w:noVBand="0" w:val="0020"/>
-        <w:tblCaption w:val="Tabla 4. Ajuste lineal y ritmo de amortiguamiento."/>
+        <w:tblCaption w:val="Tabla 5. Ajuste lineal y ritmo de amortiguamiento."/>
       </w:tblPr>
       <w:tblGrid>
         <w:gridCol w:w="1584"/>
@@ -3412,7 +3541,7 @@
         <w:jc w:val="center"/>
       </w:pPr>
       <w:r>
-        <w:t xml:space="preserve">Tabla 5. Resistencia crítica medida y teórica.</w:t>
+        <w:t xml:space="preserve">Tabla 6. Resistencia crítica medida y teórica.</w:t>
       </w:r>
     </w:p>
     <w:tbl>
@@ -3428,7 +3557,7 @@
           <w:insideV w:val="single" w:sz="6" w:color="000000"/>
         </w:tblBorders>
         <w:tblLook w:firstRow="1" w:lastRow="0" w:firstColumn="0" w:lastColumn="0" w:noHBand="0" w:noVBand="0" w:val="0020"/>
-        <w:tblCaption w:val="Tabla 5. Resistencia crítica medida y teórica."/>
+        <w:tblCaption w:val="Tabla 6. Resistencia crítica medida y teórica."/>
       </w:tblPr>
       <w:tblGrid>
         <w:gridCol w:w="2640"/>

</xml_diff>